<commit_message>
Met à jour les 4 modes d'emploi : logo de la ludothèque en page 1, contenu et captures d'écran à jour
Reflète les fonctionnalités ajoutées depuis la génération initiale des documents :
remboursements, réimpression manuelle d'étiquette, coordonnées vendeur éditables à
l'accueil, email de confirmation de réception avec rappel de la date de récupération
des invendus, quittance par email à la caisse, PDF de clôture par vendeur, et
génération aléatoire des codes d'accès.

Co-Authored-By: Claude Sonnet 5 <noreply@anthropic.com>
Claude-Session: https://claude.ai/code/session_01NjkKmFeujSWsWGAnMHqhPZ
</commit_message>
<xml_diff>
--- a/modeemploiaccueil.docx
+++ b/modeemploiaccueil.docx
@@ -8,11 +8,44 @@
         <w:jc w:val="center"/>
       </w:pPr>
       <w:r>
-        <w:rPr>
-          <w:sz w:val="72"/>
-          <w:szCs w:val="72"/>
-        </w:rPr>
-        <w:t xml:space="preserve">🎲</w:t>
+        <w:drawing>
+          <wp:inline distT="0" distB="0" distL="0" distR="0">
+            <wp:extent cx="2381250" cy="666750"/>
+            <wp:effectExtent t="0" r="0" b="0" l="0"/>
+            <wp:docPr id="1" name="" descr="" title=""/>
+            <wp:cNvGraphicFramePr>
+              <a:graphicFrameLocks xmlns:a="http://schemas.openxmlformats.org/drawingml/2006/main" noChangeAspect="1"/>
+            </wp:cNvGraphicFramePr>
+            <a:graphic xmlns:a="http://schemas.openxmlformats.org/drawingml/2006/main">
+              <a:graphicData uri="http://schemas.openxmlformats.org/drawingml/2006/picture">
+                <pic:pic xmlns:pic="http://schemas.openxmlformats.org/drawingml/2006/picture">
+                  <pic:nvPicPr>
+                    <pic:cNvPr id="0" name="" descr=""/>
+                    <pic:cNvPicPr>
+                      <a:picLocks noChangeAspect="1" noChangeArrowheads="1"/>
+                    </pic:cNvPicPr>
+                  </pic:nvPicPr>
+                  <pic:blipFill>
+                    <a:blip r:embed="rId9" cstate="none"/>
+                    <a:srcRect/>
+                    <a:stretch>
+                      <a:fillRect/>
+                    </a:stretch>
+                  </pic:blipFill>
+                  <pic:spPr bwMode="auto">
+                    <a:xfrm>
+                      <a:off x="0" y="0"/>
+                      <a:ext cx="2381250" cy="666750"/>
+                    </a:xfrm>
+                    <a:prstGeom prst="rect">
+                      <a:avLst/>
+                    </a:prstGeom>
+                  </pic:spPr>
+                </pic:pic>
+              </a:graphicData>
+            </a:graphic>
+          </wp:inline>
+        </w:drawing>
       </w:r>
     </w:p>
     <w:p>
@@ -102,7 +135,7 @@
         <w:spacing w:after="160"/>
       </w:pPr>
       <w:r>
-        <w:t xml:space="preserve">L'accueil est le point de passage de chaque vendeur le jour du dépôt : retrouver sa liste (ou la créer si elle n'a pas été déposée en ligine), contrôler les objets un par un, et imprimer les étiquettes à coller dessus.</w:t>
+        <w:t xml:space="preserve">L'accueil est le point de passage de chaque vendeur le jour du dépôt : retrouver sa liste (ou la créer si elle n'a pas été déposée en ligne), contrôler les objets un par un, et imprimer les étiquettes à coller dessus.</w:t>
       </w:r>
     </w:p>
     <w:p>
@@ -165,7 +198,7 @@
     </w:p>
     <w:tbl>
       <w:tblPr>
-        <w:tblW w:type="dxa" w:w="9675"/>
+        <w:tblW w:type="dxa" w:w="9676"/>
         <w:jc w:val="center"/>
         <w:tblBorders>
           <w:top w:val="single" w:color="D4D4D8" w:sz="4"/>
@@ -177,113 +210,11 @@
         </w:tblBorders>
       </w:tblPr>
       <w:tblGrid>
-        <w:gridCol w:w="9675"/>
+        <w:gridCol w:w="100"/>
       </w:tblGrid>
       <w:tr>
         <w:tc>
           <w:tcPr>
-            <w:tcW w:type="dxa" w:w="9675"/>
-            <w:tcMar>
-              <w:top w:type="dxa" w:w="100"/>
-              <w:left w:type="dxa" w:w="100"/>
-              <w:bottom w:type="dxa" w:w="100"/>
-              <w:right w:type="dxa" w:w="100"/>
-            </w:tcMar>
-          </w:tcPr>
-          <w:p>
-            <w:pPr>
-              <w:jc w:val="center"/>
-            </w:pPr>
-            <w:r>
-              <w:drawing>
-                <wp:inline distT="0" distB="0" distL="0" distR="0">
-                  <wp:extent cx="5762625" cy="4324350"/>
-                  <wp:effectExtent t="0" r="0" b="0" l="0"/>
-                  <wp:docPr id="1" name="" descr="" title=""/>
-                  <wp:cNvGraphicFramePr>
-                    <a:graphicFrameLocks xmlns:a="http://schemas.openxmlformats.org/drawingml/2006/main" noChangeAspect="1"/>
-                  </wp:cNvGraphicFramePr>
-                  <a:graphic xmlns:a="http://schemas.openxmlformats.org/drawingml/2006/main">
-                    <a:graphicData uri="http://schemas.openxmlformats.org/drawingml/2006/picture">
-                      <pic:pic xmlns:pic="http://schemas.openxmlformats.org/drawingml/2006/picture">
-                        <pic:nvPicPr>
-                          <pic:cNvPr id="0" name="" descr=""/>
-                          <pic:cNvPicPr>
-                            <a:picLocks noChangeAspect="1" noChangeArrowheads="1"/>
-                          </pic:cNvPicPr>
-                        </pic:nvPicPr>
-                        <pic:blipFill>
-                          <a:blip r:embed="rId9" cstate="none"/>
-                          <a:srcRect/>
-                          <a:stretch>
-                            <a:fillRect/>
-                          </a:stretch>
-                        </pic:blipFill>
-                        <pic:spPr bwMode="auto">
-                          <a:xfrm>
-                            <a:off x="0" y="0"/>
-                            <a:ext cx="5762625" cy="4324350"/>
-                          </a:xfrm>
-                          <a:prstGeom prst="rect">
-                            <a:avLst/>
-                          </a:prstGeom>
-                        </pic:spPr>
-                      </pic:pic>
-                    </a:graphicData>
-                  </a:graphic>
-                </wp:inline>
-              </w:drawing>
-            </w:r>
-          </w:p>
-        </w:tc>
-      </w:tr>
-    </w:tbl>
-    <w:p>
-      <w:pPr>
-        <w:spacing w:after="60" w:before="0"/>
-      </w:pPr>
-    </w:p>
-    <w:p>
-      <w:pPr>
-        <w:spacing w:after="200"/>
-        <w:jc w:val="center"/>
-      </w:pPr>
-      <w:r>
-        <w:rPr>
-          <w:i/>
-          <w:iCs/>
-          <w:color w:val="6B7280"/>
-          <w:sz w:val="18"/>
-          <w:szCs w:val="18"/>
-        </w:rPr>
-        <w:t xml:space="preserve">Écran de connexion — un seul champ, le code fourni par le comité.</w:t>
-      </w:r>
-    </w:p>
-    <w:p>
-      <w:pPr>
-        <w:spacing w:after="0" w:before="160"/>
-      </w:pPr>
-    </w:p>
-    <w:tbl>
-      <w:tblPr>
-        <w:tblW w:type="dxa" w:w="9675"/>
-        <w:jc w:val="center"/>
-        <w:tblBorders>
-          <w:top w:val="single" w:color="D4D4D8" w:sz="4"/>
-          <w:left w:val="single" w:color="D4D4D8" w:sz="4"/>
-          <w:bottom w:val="single" w:color="D4D4D8" w:sz="4"/>
-          <w:right w:val="single" w:color="D4D4D8" w:sz="4"/>
-          <w:insideH w:val="none" w:color="FFFFFF" w:sz="0"/>
-          <w:insideV w:val="none" w:color="FFFFFF" w:sz="0"/>
-        </w:tblBorders>
-      </w:tblPr>
-      <w:tblGrid>
-        <w:gridCol w:w="9675"/>
-      </w:tblGrid>
-      <w:tr>
-        <w:tc>
-          <w:tcPr>
-            <w:tcW w:type="dxa" w:w="9675"/>
             <w:tcMar>
               <w:top w:type="dxa" w:w="100"/>
               <w:left w:type="dxa" w:w="100"/>
@@ -357,17 +288,23 @@
           <w:sz w:val="18"/>
           <w:szCs w:val="18"/>
         </w:rPr>
-        <w:t xml:space="preserve">Page Accueil après connexion : recherche de vendeur.</w:t>
-      </w:r>
+        <w:t xml:space="preserve">Écran de connexion — un seul champ, le code fourni par le comité.</w:t>
+      </w:r>
+    </w:p>
+    <w:p>
+      <w:pPr>
+        <w:spacing w:after="0" w:before="160"/>
+      </w:pPr>
     </w:p>
     <w:tbl>
       <w:tblPr>
-        <w:tblW w:type="pct" w:w="100%"/>
+        <w:tblW w:type="dxa" w:w="9676"/>
+        <w:jc w:val="center"/>
         <w:tblBorders>
-          <w:top w:val="single" w:color="B91C1C" w:sz="6"/>
-          <w:left w:val="single" w:color="B91C1C" w:sz="6"/>
-          <w:bottom w:val="single" w:color="B91C1C" w:sz="6"/>
-          <w:right w:val="single" w:color="B91C1C" w:sz="6"/>
+          <w:top w:val="single" w:color="D4D4D8" w:sz="4"/>
+          <w:left w:val="single" w:color="D4D4D8" w:sz="4"/>
+          <w:bottom w:val="single" w:color="D4D4D8" w:sz="4"/>
+          <w:right w:val="single" w:color="D4D4D8" w:sz="4"/>
           <w:insideH w:val="none" w:color="FFFFFF" w:sz="0"/>
           <w:insideV w:val="none" w:color="FFFFFF" w:sz="0"/>
         </w:tblBorders>
@@ -378,191 +315,6 @@
       <w:tr>
         <w:tc>
           <w:tcPr>
-            <w:shd w:fill="FEF2F2" w:color="auto" w:val="clear"/>
-            <w:tcMar>
-              <w:top w:type="dxa" w:w="160"/>
-              <w:left w:type="dxa" w:w="220"/>
-              <w:bottom w:type="dxa" w:w="160"/>
-              <w:right w:type="dxa" w:w="220"/>
-            </w:tcMar>
-          </w:tcPr>
-          <w:p>
-            <w:pPr>
-              <w:spacing w:after="80"/>
-            </w:pPr>
-            <w:r>
-              <w:rPr>
-                <w:b/>
-                <w:bCs/>
-                <w:color w:val="B91C1C"/>
-              </w:rPr>
-              <w:t xml:space="preserve">🔒 Code d'accès</w:t>
-            </w:r>
-          </w:p>
-          <w:p>
-            <w:pPr>
-              <w:spacing w:after="40"/>
-            </w:pPr>
-            <w:r>
-              <w:rPr>
-                <w:sz w:val="20"/>
-                <w:szCs w:val="20"/>
-              </w:rPr>
-              <w:t xml:space="preserve">Le code d'accueil est propre à l'événement et peut être utilisé simultanément sur plusieurs appareils (plusieurs bénévoles à l'accueil en même temps). Après plusieurs codes erronés d'affilée, l'accès est bloqué temporairement par sécurité — pas d'inquiétude si ça arrive, ça se débloque tout seul après une minute.</w:t>
-            </w:r>
-          </w:p>
-        </w:tc>
-      </w:tr>
-    </w:tbl>
-    <w:p>
-      <w:pPr>
-        <w:pStyle w:val="Heading1"/>
-        <w:spacing w:after="200" w:before="400"/>
-      </w:pPr>
-      <w:r>
-        <w:rPr>
-          <w:b/>
-          <w:bCs/>
-          <w:color w:val="1F2937"/>
-        </w:rPr>
-        <w:t xml:space="preserve">Avant l'ouverture : préparer les étiquettes</w:t>
-      </w:r>
-    </w:p>
-    <w:tbl>
-      <w:tblPr>
-        <w:tblW w:type="pct" w:w="100%"/>
-        <w:tblBorders>
-          <w:top w:val="single" w:color="16A34A" w:sz="6"/>
-          <w:left w:val="single" w:color="16A34A" w:sz="6"/>
-          <w:bottom w:val="single" w:color="16A34A" w:sz="6"/>
-          <w:right w:val="single" w:color="16A34A" w:sz="6"/>
-          <w:insideH w:val="none" w:color="FFFFFF" w:sz="0"/>
-          <w:insideV w:val="none" w:color="FFFFFF" w:sz="0"/>
-        </w:tblBorders>
-      </w:tblPr>
-      <w:tblGrid>
-        <w:gridCol w:w="100"/>
-      </w:tblGrid>
-      <w:tr>
-        <w:tc>
-          <w:tcPr>
-            <w:shd w:fill="F0FDF4" w:color="auto" w:val="clear"/>
-            <w:tcMar>
-              <w:top w:type="dxa" w:w="160"/>
-              <w:left w:type="dxa" w:w="220"/>
-              <w:bottom w:type="dxa" w:w="160"/>
-              <w:right w:type="dxa" w:w="220"/>
-            </w:tcMar>
-          </w:tcPr>
-          <w:p>
-            <w:pPr>
-              <w:spacing w:after="80"/>
-            </w:pPr>
-            <w:r>
-              <w:rPr>
-                <w:b/>
-                <w:bCs/>
-                <w:color w:val="15803D"/>
-              </w:rPr>
-              <w:t xml:space="preserve">💡 Organisation recommandée</w:t>
-            </w:r>
-          </w:p>
-          <w:p>
-            <w:pPr>
-              <w:spacing w:after="40"/>
-            </w:pPr>
-            <w:r>
-              <w:rPr>
-                <w:sz w:val="20"/>
-                <w:szCs w:val="20"/>
-              </w:rPr>
-              <w:t xml:space="preserve">Les feuilles d'étiquettes de tous les vendeurs ayant déposé leur liste en ligne peuvent être imprimées à l'avance. Une fois imprimées, elles sont réparties sur une table par initiale du nom de famille du vendeur (A-E, F-K, etc.) — cela permet de retrouver immédiatement la bonne feuille dès que le vendeur arrive et donne son nom, sans devoir la réimprimer sur place ni faire attendre la file.</w:t>
-            </w:r>
-          </w:p>
-        </w:tc>
-      </w:tr>
-    </w:tbl>
-    <w:p>
-      <w:pPr>
-        <w:spacing w:after="160"/>
-      </w:pPr>
-      <w:r>
-        <w:t xml:space="preserve">Pour imprimer les étiquettes d'un vendeur à l'avance : le retrouver (voir ci-dessous), puis cliquer sur « Imprimer les étiquettes ».</w:t>
-      </w:r>
-    </w:p>
-    <w:p>
-      <w:pPr>
-        <w:pStyle w:val="Heading1"/>
-        <w:spacing w:after="200" w:before="400"/>
-      </w:pPr>
-      <w:r>
-        <w:rPr>
-          <w:b/>
-          <w:bCs/>
-          <w:color w:val="1F2937"/>
-        </w:rPr>
-        <w:t xml:space="preserve">Retrouver un vendeur</w:t>
-      </w:r>
-    </w:p>
-    <w:p>
-      <w:pPr>
-        <w:spacing w:after="160"/>
-      </w:pPr>
-      <w:r>
-        <w:t xml:space="preserve">Deux façons de retrouver une liste depuis la page Accueil :</w:t>
-      </w:r>
-    </w:p>
-    <w:p>
-      <w:pPr>
-        <w:pStyle w:val="ListParagraph"/>
-        <w:numPr>
-          <w:ilvl w:val="0"/>
-          <w:numId w:val="3"/>
-        </w:numPr>
-        <w:spacing w:after="80"/>
-      </w:pPr>
-      <w:r>
-        <w:t xml:space="preserve">Recherche par nom ou par code de confirmation, dans le champ de recherche.</w:t>
-      </w:r>
-    </w:p>
-    <w:p>
-      <w:pPr>
-        <w:pStyle w:val="ListParagraph"/>
-        <w:numPr>
-          <w:ilvl w:val="0"/>
-          <w:numId w:val="3"/>
-        </w:numPr>
-        <w:spacing w:after="80"/>
-      </w:pPr>
-      <w:r>
-        <w:t xml:space="preserve">Bouton « Scanner » pour lire directement le QR code présenté par le vendeur (téléphone ou étiquette imprimée).</w:t>
-      </w:r>
-    </w:p>
-    <w:p>
-      <w:pPr>
-        <w:spacing w:after="0" w:before="160"/>
-      </w:pPr>
-    </w:p>
-    <w:tbl>
-      <w:tblPr>
-        <w:tblW w:type="dxa" w:w="9675"/>
-        <w:jc w:val="center"/>
-        <w:tblBorders>
-          <w:top w:val="single" w:color="D4D4D8" w:sz="4"/>
-          <w:left w:val="single" w:color="D4D4D8" w:sz="4"/>
-          <w:bottom w:val="single" w:color="D4D4D8" w:sz="4"/>
-          <w:right w:val="single" w:color="D4D4D8" w:sz="4"/>
-          <w:insideH w:val="none" w:color="FFFFFF" w:sz="0"/>
-          <w:insideV w:val="none" w:color="FFFFFF" w:sz="0"/>
-        </w:tblBorders>
-      </w:tblPr>
-      <w:tblGrid>
-        <w:gridCol w:w="9675"/>
-      </w:tblGrid>
-      <w:tr>
-        <w:tc>
-          <w:tcPr>
-            <w:tcW w:type="dxa" w:w="9675"/>
             <w:tcMar>
               <w:top w:type="dxa" w:w="100"/>
               <w:left w:type="dxa" w:w="100"/>
@@ -636,9 +388,63 @@
           <w:sz w:val="18"/>
           <w:szCs w:val="18"/>
         </w:rPr>
-        <w:t xml:space="preserve">Résultat d'une recherche par nom.</w:t>
-      </w:r>
-    </w:p>
+        <w:t xml:space="preserve">Page Accueil après connexion : recherche de vendeur.</w:t>
+      </w:r>
+    </w:p>
+    <w:tbl>
+      <w:tblPr>
+        <w:tblW w:type="pct" w:w="100%"/>
+        <w:tblBorders>
+          <w:top w:val="single" w:color="B91C1C" w:sz="6"/>
+          <w:left w:val="single" w:color="B91C1C" w:sz="6"/>
+          <w:bottom w:val="single" w:color="B91C1C" w:sz="6"/>
+          <w:right w:val="single" w:color="B91C1C" w:sz="6"/>
+          <w:insideH w:val="none" w:color="FFFFFF" w:sz="0"/>
+          <w:insideV w:val="none" w:color="FFFFFF" w:sz="0"/>
+        </w:tblBorders>
+      </w:tblPr>
+      <w:tblGrid>
+        <w:gridCol w:w="100"/>
+      </w:tblGrid>
+      <w:tr>
+        <w:tc>
+          <w:tcPr>
+            <w:shd w:fill="FEF2F2" w:val="clear"/>
+            <w:tcMar>
+              <w:top w:type="dxa" w:w="160"/>
+              <w:left w:type="dxa" w:w="220"/>
+              <w:bottom w:type="dxa" w:w="160"/>
+              <w:right w:type="dxa" w:w="220"/>
+            </w:tcMar>
+          </w:tcPr>
+          <w:p>
+            <w:pPr>
+              <w:spacing w:after="80"/>
+            </w:pPr>
+            <w:r>
+              <w:rPr>
+                <w:b/>
+                <w:bCs/>
+                <w:color w:val="B91C1C"/>
+              </w:rPr>
+              <w:t xml:space="preserve">🔒 Code d'accès</w:t>
+            </w:r>
+          </w:p>
+          <w:p>
+            <w:pPr>
+              <w:spacing w:after="40"/>
+            </w:pPr>
+            <w:r>
+              <w:rPr>
+                <w:sz w:val="20"/>
+                <w:szCs w:val="20"/>
+              </w:rPr>
+              <w:t xml:space="preserve">Le code d'accueil est propre à l'événement et peut être utilisé simultanément sur plusieurs appareils (plusieurs bénévoles à l'accueil en même temps). Après plusieurs codes erronés d'affilée, l'accès est bloqué temporairement par sécurité — pas d'inquiétude si ça arrive, ça se débloque tout seul après une minute.</w:t>
+            </w:r>
+          </w:p>
+        </w:tc>
+      </w:tr>
+    </w:tbl>
     <w:p>
       <w:pPr>
         <w:pStyle w:val="Heading1"/>
@@ -650,25 +456,127 @@
           <w:bCs/>
           <w:color w:val="1F2937"/>
         </w:rPr>
-        <w:t xml:space="preserve">Contrôler la liste</w:t>
-      </w:r>
-    </w:p>
-    <w:p>
-      <w:pPr>
-        <w:spacing w:after="160"/>
-      </w:pPr>
-      <w:r>
-        <w:t xml:space="preserve">Sur la fiche du vendeur, chaque article est à accepter ou refuser individuellement. Le nom et le prix restent modifiables directement dans le champ, si besoin de corriger une erreur de saisie.</w:t>
-      </w:r>
-    </w:p>
-    <w:p>
-      <w:pPr>
-        <w:spacing w:after="0" w:before="160"/>
-      </w:pPr>
+        <w:t xml:space="preserve">Avant l'ouverture : préparer les étiquettes</w:t>
+      </w:r>
     </w:p>
     <w:tbl>
       <w:tblPr>
-        <w:tblW w:type="dxa" w:w="9675"/>
+        <w:tblW w:type="pct" w:w="100%"/>
+        <w:tblBorders>
+          <w:top w:val="single" w:color="16A34A" w:sz="6"/>
+          <w:left w:val="single" w:color="16A34A" w:sz="6"/>
+          <w:bottom w:val="single" w:color="16A34A" w:sz="6"/>
+          <w:right w:val="single" w:color="16A34A" w:sz="6"/>
+          <w:insideH w:val="none" w:color="FFFFFF" w:sz="0"/>
+          <w:insideV w:val="none" w:color="FFFFFF" w:sz="0"/>
+        </w:tblBorders>
+      </w:tblPr>
+      <w:tblGrid>
+        <w:gridCol w:w="100"/>
+      </w:tblGrid>
+      <w:tr>
+        <w:tc>
+          <w:tcPr>
+            <w:shd w:fill="F0FDF4" w:val="clear"/>
+            <w:tcMar>
+              <w:top w:type="dxa" w:w="160"/>
+              <w:left w:type="dxa" w:w="220"/>
+              <w:bottom w:type="dxa" w:w="160"/>
+              <w:right w:type="dxa" w:w="220"/>
+            </w:tcMar>
+          </w:tcPr>
+          <w:p>
+            <w:pPr>
+              <w:spacing w:after="80"/>
+            </w:pPr>
+            <w:r>
+              <w:rPr>
+                <w:b/>
+                <w:bCs/>
+                <w:color w:val="15803D"/>
+              </w:rPr>
+              <w:t xml:space="preserve">💡 Organisation recommandée</w:t>
+            </w:r>
+          </w:p>
+          <w:p>
+            <w:pPr>
+              <w:spacing w:after="40"/>
+            </w:pPr>
+            <w:r>
+              <w:rPr>
+                <w:sz w:val="20"/>
+                <w:szCs w:val="20"/>
+              </w:rPr>
+              <w:t xml:space="preserve">Les feuilles d'étiquettes de tous les vendeurs ayant déposé leur liste en ligne peuvent être imprimées à l'avance. Une fois imprimées, elles sont réparties sur une table par initiale du nom de famille du vendeur (A-E, F-K, etc.) — cela permet de retrouver immédiatement la bonne feuille dès que le vendeur arrive et donne son nom, sans devoir la réimprimer sur place ni faire attendre la file.</w:t>
+            </w:r>
+          </w:p>
+        </w:tc>
+      </w:tr>
+    </w:tbl>
+    <w:p>
+      <w:pPr>
+        <w:spacing w:after="160"/>
+      </w:pPr>
+      <w:r>
+        <w:t xml:space="preserve">Pour imprimer les étiquettes d'un vendeur à l'avance : le retrouver (voir ci-dessous), puis cliquer sur « Imprimer les étiquettes ».</w:t>
+      </w:r>
+    </w:p>
+    <w:p>
+      <w:pPr>
+        <w:pStyle w:val="Heading1"/>
+        <w:spacing w:after="200" w:before="400"/>
+      </w:pPr>
+      <w:r>
+        <w:rPr>
+          <w:b/>
+          <w:bCs/>
+          <w:color w:val="1F2937"/>
+        </w:rPr>
+        <w:t xml:space="preserve">Retrouver un vendeur</w:t>
+      </w:r>
+    </w:p>
+    <w:p>
+      <w:pPr>
+        <w:spacing w:after="80"/>
+      </w:pPr>
+      <w:r>
+        <w:t xml:space="preserve">Deux façons de retrouver une liste depuis la page Accueil :</w:t>
+      </w:r>
+    </w:p>
+    <w:p>
+      <w:pPr>
+        <w:pStyle w:val="ListParagraph"/>
+        <w:numPr>
+          <w:ilvl w:val="0"/>
+          <w:numId w:val="3"/>
+        </w:numPr>
+        <w:spacing w:after="80"/>
+      </w:pPr>
+      <w:r>
+        <w:t xml:space="preserve">Recherche par nom ou par code de confirmation, dans le champ de recherche.</w:t>
+      </w:r>
+    </w:p>
+    <w:p>
+      <w:pPr>
+        <w:pStyle w:val="ListParagraph"/>
+        <w:numPr>
+          <w:ilvl w:val="0"/>
+          <w:numId w:val="3"/>
+        </w:numPr>
+        <w:spacing w:after="80"/>
+      </w:pPr>
+      <w:r>
+        <w:t xml:space="preserve">Bouton « Scanner » pour lire directement le QR code présenté par le vendeur (téléphone ou étiquette imprimée).</w:t>
+      </w:r>
+    </w:p>
+    <w:p>
+      <w:pPr>
+        <w:spacing w:after="0" w:before="160"/>
+      </w:pPr>
+    </w:p>
+    <w:tbl>
+      <w:tblPr>
+        <w:tblW w:type="dxa" w:w="9676"/>
         <w:jc w:val="center"/>
         <w:tblBorders>
           <w:top w:val="single" w:color="D4D4D8" w:sz="4"/>
@@ -680,12 +588,11 @@
         </w:tblBorders>
       </w:tblPr>
       <w:tblGrid>
-        <w:gridCol w:w="9675"/>
+        <w:gridCol w:w="100"/>
       </w:tblGrid>
       <w:tr>
         <w:tc>
           <w:tcPr>
-            <w:tcW w:type="dxa" w:w="9675"/>
             <w:tcMar>
               <w:top w:type="dxa" w:w="100"/>
               <w:left w:type="dxa" w:w="100"/>
@@ -759,17 +666,45 @@
           <w:sz w:val="18"/>
           <w:szCs w:val="18"/>
         </w:rPr>
-        <w:t xml:space="preserve">Fiche vendeur : un article par ligne, à accepter ou refuser.</w:t>
-      </w:r>
+        <w:t xml:space="preserve">Résultat d'une recherche par nom.</w:t>
+      </w:r>
+    </w:p>
+    <w:p>
+      <w:pPr>
+        <w:pStyle w:val="Heading1"/>
+        <w:spacing w:after="200" w:before="400"/>
+      </w:pPr>
+      <w:r>
+        <w:rPr>
+          <w:b/>
+          <w:bCs/>
+          <w:color w:val="1F2937"/>
+        </w:rPr>
+        <w:t xml:space="preserve">Contrôler la liste</w:t>
+      </w:r>
+    </w:p>
+    <w:p>
+      <w:pPr>
+        <w:spacing w:after="160"/>
+      </w:pPr>
+      <w:r>
+        <w:t xml:space="preserve">Sur la fiche du vendeur, chaque article est à accepter ou refuser individuellement. Le nom et le prix restent modifiables directement dans le champ, si besoin de corriger une erreur de saisie.</w:t>
+      </w:r>
+    </w:p>
+    <w:p>
+      <w:pPr>
+        <w:spacing w:after="0" w:before="160"/>
+      </w:pPr>
     </w:p>
     <w:tbl>
       <w:tblPr>
-        <w:tblW w:type="pct" w:w="100%"/>
+        <w:tblW w:type="dxa" w:w="9676"/>
+        <w:jc w:val="center"/>
         <w:tblBorders>
-          <w:top w:val="single" w:color="B91C1C" w:sz="6"/>
-          <w:left w:val="single" w:color="B91C1C" w:sz="6"/>
-          <w:bottom w:val="single" w:color="B91C1C" w:sz="6"/>
-          <w:right w:val="single" w:color="B91C1C" w:sz="6"/>
+          <w:top w:val="single" w:color="D4D4D8" w:sz="4"/>
+          <w:left w:val="single" w:color="D4D4D8" w:sz="4"/>
+          <w:bottom w:val="single" w:color="D4D4D8" w:sz="4"/>
+          <w:right w:val="single" w:color="D4D4D8" w:sz="4"/>
           <w:insideH w:val="none" w:color="FFFFFF" w:sz="0"/>
           <w:insideV w:val="none" w:color="FFFFFF" w:sz="0"/>
         </w:tblBorders>
@@ -780,101 +715,6 @@
       <w:tr>
         <w:tc>
           <w:tcPr>
-            <w:shd w:fill="FEF2F2" w:color="auto" w:val="clear"/>
-            <w:tcMar>
-              <w:top w:type="dxa" w:w="160"/>
-              <w:left w:type="dxa" w:w="220"/>
-              <w:bottom w:type="dxa" w:w="160"/>
-              <w:right w:type="dxa" w:w="220"/>
-            </w:tcMar>
-          </w:tcPr>
-          <w:p>
-            <w:pPr>
-              <w:spacing w:after="80"/>
-            </w:pPr>
-            <w:r>
-              <w:rPr>
-                <w:b/>
-                <w:bCs/>
-                <w:color w:val="B91C1C"/>
-              </w:rPr>
-              <w:t xml:space="preserve">🔒 Objets non admis au troc</w:t>
-            </w:r>
-          </w:p>
-          <w:p>
-            <w:pPr>
-              <w:spacing w:after="40"/>
-            </w:pPr>
-            <w:r>
-              <w:rPr>
-                <w:sz w:val="20"/>
-                <w:szCs w:val="20"/>
-              </w:rPr>
-              <w:t xml:space="preserve">Certains objets ne sont pas acceptés (peluches, DVD, CD, VHS — voir le règlement). Si un nom d'article y correspond, un message l'indique à la saisie, aussi bien côté vendeur que côté accueil.</w:t>
-            </w:r>
-          </w:p>
-        </w:tc>
-      </w:tr>
-    </w:tbl>
-    <w:p>
-      <w:pPr>
-        <w:spacing w:after="160"/>
-      </w:pPr>
-      <w:r>
-        <w:t xml:space="preserve">Une fois chaque article traité (accepté ou refusé), deux boutons apparaissent successivement :</w:t>
-      </w:r>
-    </w:p>
-    <w:p>
-      <w:pPr>
-        <w:pStyle w:val="ListParagraph"/>
-        <w:numPr>
-          <w:ilvl w:val="0"/>
-          <w:numId w:val="2"/>
-        </w:numPr>
-        <w:spacing w:after="80"/>
-      </w:pPr>
-      <w:r>
-        <w:t xml:space="preserve">« Marquer comme contrôlée » — une fois tous les articles passés en revue.</w:t>
-      </w:r>
-    </w:p>
-    <w:p>
-      <w:pPr>
-        <w:pStyle w:val="ListParagraph"/>
-        <w:numPr>
-          <w:ilvl w:val="0"/>
-          <w:numId w:val="2"/>
-        </w:numPr>
-        <w:spacing w:after="80"/>
-      </w:pPr>
-      <w:r>
-        <w:t xml:space="preserve">« Terminer » — valide définitivement la liste pour cette édition.</w:t>
-      </w:r>
-    </w:p>
-    <w:p>
-      <w:pPr>
-        <w:spacing w:after="0" w:before="160"/>
-      </w:pPr>
-    </w:p>
-    <w:tbl>
-      <w:tblPr>
-        <w:tblW w:type="dxa" w:w="9675"/>
-        <w:jc w:val="center"/>
-        <w:tblBorders>
-          <w:top w:val="single" w:color="D4D4D8" w:sz="4"/>
-          <w:left w:val="single" w:color="D4D4D8" w:sz="4"/>
-          <w:bottom w:val="single" w:color="D4D4D8" w:sz="4"/>
-          <w:right w:val="single" w:color="D4D4D8" w:sz="4"/>
-          <w:insideH w:val="none" w:color="FFFFFF" w:sz="0"/>
-          <w:insideV w:val="none" w:color="FFFFFF" w:sz="0"/>
-        </w:tblBorders>
-      </w:tblPr>
-      <w:tblGrid>
-        <w:gridCol w:w="9675"/>
-      </w:tblGrid>
-      <w:tr>
-        <w:tc>
-          <w:tcPr>
-            <w:tcW w:type="dxa" w:w="9675"/>
             <w:tcMar>
               <w:top w:type="dxa" w:w="100"/>
               <w:left w:type="dxa" w:w="100"/>
@@ -948,39 +788,105 @@
           <w:sz w:val="18"/>
           <w:szCs w:val="18"/>
         </w:rPr>
-        <w:t xml:space="preserve">Liste entièrement contrôlée : un article refusé, trois acceptés, bouton « Terminer » disponible.</w:t>
-      </w:r>
-    </w:p>
-    <w:p>
-      <w:pPr>
-        <w:pStyle w:val="Heading1"/>
-        <w:spacing w:after="200" w:before="400"/>
-      </w:pPr>
-      <w:r>
-        <w:rPr>
-          <w:b/>
-          <w:bCs/>
-          <w:color w:val="1F2937"/>
-        </w:rPr>
-        <w:t xml:space="preserve">Imprimer les étiquettes</w:t>
-      </w:r>
-    </w:p>
-    <w:p>
-      <w:pPr>
-        <w:spacing w:after="160"/>
-      </w:pPr>
-      <w:r>
-        <w:t xml:space="preserve">Le bouton « Imprimer les étiquettes » génère une planche prête à découper : une étiquette par article, avec son QR code, son prix et le numéro du vendeur — plus une étiquette d'en-tête avec le nom et le numéro du vendeur, à poser sur son enveloppe ou son bac.</w:t>
-      </w:r>
-    </w:p>
-    <w:p>
-      <w:pPr>
-        <w:spacing w:after="0" w:before="160"/>
-      </w:pPr>
+        <w:t xml:space="preserve">Fiche vendeur : un article par ligne, à accepter ou refuser.</w:t>
+      </w:r>
     </w:p>
     <w:tbl>
       <w:tblPr>
-        <w:tblW w:type="dxa" w:w="9675"/>
+        <w:tblW w:type="pct" w:w="100%"/>
+        <w:tblBorders>
+          <w:top w:val="single" w:color="B91C1C" w:sz="6"/>
+          <w:left w:val="single" w:color="B91C1C" w:sz="6"/>
+          <w:bottom w:val="single" w:color="B91C1C" w:sz="6"/>
+          <w:right w:val="single" w:color="B91C1C" w:sz="6"/>
+          <w:insideH w:val="none" w:color="FFFFFF" w:sz="0"/>
+          <w:insideV w:val="none" w:color="FFFFFF" w:sz="0"/>
+        </w:tblBorders>
+      </w:tblPr>
+      <w:tblGrid>
+        <w:gridCol w:w="100"/>
+      </w:tblGrid>
+      <w:tr>
+        <w:tc>
+          <w:tcPr>
+            <w:shd w:fill="FEF2F2" w:val="clear"/>
+            <w:tcMar>
+              <w:top w:type="dxa" w:w="160"/>
+              <w:left w:type="dxa" w:w="220"/>
+              <w:bottom w:type="dxa" w:w="160"/>
+              <w:right w:type="dxa" w:w="220"/>
+            </w:tcMar>
+          </w:tcPr>
+          <w:p>
+            <w:pPr>
+              <w:spacing w:after="80"/>
+            </w:pPr>
+            <w:r>
+              <w:rPr>
+                <w:b/>
+                <w:bCs/>
+                <w:color w:val="B91C1C"/>
+              </w:rPr>
+              <w:t xml:space="preserve">🔒 Objets non admis au troc</w:t>
+            </w:r>
+          </w:p>
+          <w:p>
+            <w:pPr>
+              <w:spacing w:after="40"/>
+            </w:pPr>
+            <w:r>
+              <w:rPr>
+                <w:sz w:val="20"/>
+                <w:szCs w:val="20"/>
+              </w:rPr>
+              <w:t xml:space="preserve">Certains objets ne sont pas acceptés (peluches, DVD, CD, VHS — voir le règlement). Si un nom d'article y correspond, un message l'indique à la saisie, aussi bien côté vendeur que côté accueil.</w:t>
+            </w:r>
+          </w:p>
+        </w:tc>
+      </w:tr>
+    </w:tbl>
+    <w:p>
+      <w:pPr>
+        <w:spacing w:after="80"/>
+      </w:pPr>
+      <w:r>
+        <w:t xml:space="preserve">Une fois chaque article traité (accepté ou refusé), deux boutons apparaissent successivement :</w:t>
+      </w:r>
+    </w:p>
+    <w:p>
+      <w:pPr>
+        <w:pStyle w:val="ListParagraph"/>
+        <w:numPr>
+          <w:ilvl w:val="0"/>
+          <w:numId w:val="2"/>
+        </w:numPr>
+        <w:spacing w:after="80"/>
+      </w:pPr>
+      <w:r>
+        <w:t xml:space="preserve">« Marquer comme contrôlée » — une fois tous les articles passés en revue.</w:t>
+      </w:r>
+    </w:p>
+    <w:p>
+      <w:pPr>
+        <w:pStyle w:val="ListParagraph"/>
+        <w:numPr>
+          <w:ilvl w:val="0"/>
+          <w:numId w:val="2"/>
+        </w:numPr>
+        <w:spacing w:after="80"/>
+      </w:pPr>
+      <w:r>
+        <w:t xml:space="preserve">« Terminer » — valide définitivement la liste pour cette édition.</w:t>
+      </w:r>
+    </w:p>
+    <w:p>
+      <w:pPr>
+        <w:spacing w:after="0" w:before="160"/>
+      </w:pPr>
+    </w:p>
+    <w:tbl>
+      <w:tblPr>
+        <w:tblW w:type="dxa" w:w="9676"/>
         <w:jc w:val="center"/>
         <w:tblBorders>
           <w:top w:val="single" w:color="D4D4D8" w:sz="4"/>
@@ -992,12 +898,11 @@
         </w:tblBorders>
       </w:tblPr>
       <w:tblGrid>
-        <w:gridCol w:w="9675"/>
+        <w:gridCol w:w="100"/>
       </w:tblGrid>
       <w:tr>
         <w:tc>
           <w:tcPr>
-            <w:tcW w:type="dxa" w:w="9675"/>
             <w:tcMar>
               <w:top w:type="dxa" w:w="100"/>
               <w:left w:type="dxa" w:w="100"/>
@@ -1071,29 +976,7 @@
           <w:sz w:val="18"/>
           <w:szCs w:val="18"/>
         </w:rPr>
-        <w:t xml:space="preserve">Planche d'étiquettes prête à imprimer et découper.</w:t>
-      </w:r>
-    </w:p>
-    <w:p>
-      <w:pPr>
-        <w:pStyle w:val="Heading1"/>
-        <w:spacing w:after="200" w:before="400"/>
-      </w:pPr>
-      <w:r>
-        <w:rPr>
-          <w:b/>
-          <w:bCs/>
-          <w:color w:val="1F2937"/>
-        </w:rPr>
-        <w:t xml:space="preserve">Un vendeur sans dépôt en ligne</w:t>
-      </w:r>
-    </w:p>
-    <w:p>
-      <w:pPr>
-        <w:spacing w:after="160"/>
-      </w:pPr>
-      <w:r>
-        <w:t xml:space="preserve">Si un vendeur se présente sans avoir déposé sa liste en ligne au préalable, le bouton « + Liste sur place » (en haut de la page Accueil) permet de saisir sa liste directement — mêmes champs, mêmes contrôles que le formulaire en ligne (nom, téléphone portable, conditions à accepter, articles).</w:t>
+        <w:t xml:space="preserve">Liste entièrement contrôlée : un article refusé, deux acceptés, bouton « Marquer comme contrôlée » disponible.</w:t>
       </w:r>
     </w:p>
     <w:p>
@@ -1103,7 +986,7 @@
     </w:p>
     <w:tbl>
       <w:tblPr>
-        <w:tblW w:type="dxa" w:w="6870"/>
+        <w:tblW w:type="dxa" w:w="9676"/>
         <w:jc w:val="center"/>
         <w:tblBorders>
           <w:top w:val="single" w:color="D4D4D8" w:sz="4"/>
@@ -1115,12 +998,11 @@
         </w:tblBorders>
       </w:tblPr>
       <w:tblGrid>
-        <w:gridCol w:w="6870"/>
+        <w:gridCol w:w="100"/>
       </w:tblGrid>
       <w:tr>
         <w:tc>
           <w:tcPr>
-            <w:tcW w:type="dxa" w:w="6870"/>
             <w:tcMar>
               <w:top w:type="dxa" w:w="100"/>
               <w:left w:type="dxa" w:w="100"/>
@@ -1135,7 +1017,7 @@
             <w:r>
               <w:drawing>
                 <wp:inline distT="0" distB="0" distL="0" distR="0">
-                  <wp:extent cx="3981450" cy="7496175"/>
+                  <wp:extent cx="5762625" cy="4324350"/>
                   <wp:effectExtent t="0" r="0" b="0" l="0"/>
                   <wp:docPr id="1" name="" descr="" title=""/>
                   <wp:cNvGraphicFramePr>
@@ -1160,7 +1042,810 @@
                         <pic:spPr bwMode="auto">
                           <a:xfrm>
                             <a:off x="0" y="0"/>
-                            <a:ext cx="3981450" cy="7496175"/>
+                            <a:ext cx="5762625" cy="4324350"/>
+                          </a:xfrm>
+                          <a:prstGeom prst="rect">
+                            <a:avLst/>
+                          </a:prstGeom>
+                        </pic:spPr>
+                      </pic:pic>
+                    </a:graphicData>
+                  </a:graphic>
+                </wp:inline>
+              </w:drawing>
+            </w:r>
+          </w:p>
+        </w:tc>
+      </w:tr>
+    </w:tbl>
+    <w:p>
+      <w:pPr>
+        <w:spacing w:after="60" w:before="0"/>
+      </w:pPr>
+    </w:p>
+    <w:p>
+      <w:pPr>
+        <w:spacing w:after="200"/>
+        <w:jc w:val="center"/>
+      </w:pPr>
+      <w:r>
+        <w:rPr>
+          <w:i/>
+          <w:iCs/>
+          <w:color w:val="6B7280"/>
+          <w:sz w:val="18"/>
+          <w:szCs w:val="18"/>
+        </w:rPr>
+        <w:t xml:space="preserve">Après contrôle : badge « Contrôlée », bouton « Terminer » disponible.</w:t>
+      </w:r>
+    </w:p>
+    <w:p>
+      <w:pPr>
+        <w:pStyle w:val="Heading1"/>
+        <w:spacing w:after="200" w:before="400"/>
+      </w:pPr>
+      <w:r>
+        <w:rPr>
+          <w:b/>
+          <w:bCs/>
+          <w:color w:val="1F2937"/>
+        </w:rPr>
+        <w:t xml:space="preserve">Un email de confirmation envoyé automatiquement</w:t>
+      </w:r>
+    </w:p>
+    <w:p>
+      <w:pPr>
+        <w:spacing w:after="160"/>
+      </w:pPr>
+      <w:r>
+        <w:t xml:space="preserve">Dès que la liste est marquée « Contrôlée », un email part automatiquement au vendeur (si une adresse a été renseignée) pour confirmer la bonne réception de ses articles. Il contient à nouveau son code de confirmation et son QR code, ainsi qu'un rappel de la date et l'heure à laquelle il pourra venir récupérer ses éventuels invendus le lendemain.</w:t>
+      </w:r>
+    </w:p>
+    <w:p>
+      <w:pPr>
+        <w:spacing w:after="0" w:before="160"/>
+      </w:pPr>
+    </w:p>
+    <w:tbl>
+      <w:tblPr>
+        <w:tblW w:type="dxa" w:w="9676"/>
+        <w:jc w:val="center"/>
+        <w:tblBorders>
+          <w:top w:val="single" w:color="D4D4D8" w:sz="4"/>
+          <w:left w:val="single" w:color="D4D4D8" w:sz="4"/>
+          <w:bottom w:val="single" w:color="D4D4D8" w:sz="4"/>
+          <w:right w:val="single" w:color="D4D4D8" w:sz="4"/>
+          <w:insideH w:val="none" w:color="FFFFFF" w:sz="0"/>
+          <w:insideV w:val="none" w:color="FFFFFF" w:sz="0"/>
+        </w:tblBorders>
+      </w:tblPr>
+      <w:tblGrid>
+        <w:gridCol w:w="100"/>
+      </w:tblGrid>
+      <w:tr>
+        <w:tc>
+          <w:tcPr>
+            <w:tcMar>
+              <w:top w:type="dxa" w:w="100"/>
+              <w:left w:type="dxa" w:w="100"/>
+              <w:bottom w:type="dxa" w:w="100"/>
+              <w:right w:type="dxa" w:w="100"/>
+            </w:tcMar>
+          </w:tcPr>
+          <w:p>
+            <w:pPr>
+              <w:jc w:val="center"/>
+            </w:pPr>
+            <w:r>
+              <w:drawing>
+                <wp:inline distT="0" distB="0" distL="0" distR="0">
+                  <wp:extent cx="5762625" cy="6305550"/>
+                  <wp:effectExtent t="0" r="0" b="0" l="0"/>
+                  <wp:docPr id="1" name="" descr="" title=""/>
+                  <wp:cNvGraphicFramePr>
+                    <a:graphicFrameLocks xmlns:a="http://schemas.openxmlformats.org/drawingml/2006/main" noChangeAspect="1"/>
+                  </wp:cNvGraphicFramePr>
+                  <a:graphic xmlns:a="http://schemas.openxmlformats.org/drawingml/2006/main">
+                    <a:graphicData uri="http://schemas.openxmlformats.org/drawingml/2006/picture">
+                      <pic:pic xmlns:pic="http://schemas.openxmlformats.org/drawingml/2006/picture">
+                        <pic:nvPicPr>
+                          <pic:cNvPr id="0" name="" descr=""/>
+                          <pic:cNvPicPr>
+                            <a:picLocks noChangeAspect="1" noChangeArrowheads="1"/>
+                          </pic:cNvPicPr>
+                        </pic:nvPicPr>
+                        <pic:blipFill>
+                          <a:blip r:embed="rId16" cstate="none"/>
+                          <a:srcRect/>
+                          <a:stretch>
+                            <a:fillRect/>
+                          </a:stretch>
+                        </pic:blipFill>
+                        <pic:spPr bwMode="auto">
+                          <a:xfrm>
+                            <a:off x="0" y="0"/>
+                            <a:ext cx="5762625" cy="6305550"/>
+                          </a:xfrm>
+                          <a:prstGeom prst="rect">
+                            <a:avLst/>
+                          </a:prstGeom>
+                        </pic:spPr>
+                      </pic:pic>
+                    </a:graphicData>
+                  </a:graphic>
+                </wp:inline>
+              </w:drawing>
+            </w:r>
+          </w:p>
+        </w:tc>
+      </w:tr>
+    </w:tbl>
+    <w:p>
+      <w:pPr>
+        <w:spacing w:after="60" w:before="0"/>
+      </w:pPr>
+    </w:p>
+    <w:p>
+      <w:pPr>
+        <w:spacing w:after="200"/>
+        <w:jc w:val="center"/>
+      </w:pPr>
+      <w:r>
+        <w:rPr>
+          <w:i/>
+          <w:iCs/>
+          <w:color w:val="6B7280"/>
+          <w:sz w:val="18"/>
+          <w:szCs w:val="18"/>
+        </w:rPr>
+        <w:t xml:space="preserve">Email de réception confirmée, envoyé automatiquement au vendeur après contrôle.</w:t>
+      </w:r>
+    </w:p>
+    <w:tbl>
+      <w:tblPr>
+        <w:tblW w:type="pct" w:w="100%"/>
+        <w:tblBorders>
+          <w:top w:val="single" w:color="16A34A" w:sz="6"/>
+          <w:left w:val="single" w:color="16A34A" w:sz="6"/>
+          <w:bottom w:val="single" w:color="16A34A" w:sz="6"/>
+          <w:right w:val="single" w:color="16A34A" w:sz="6"/>
+          <w:insideH w:val="none" w:color="FFFFFF" w:sz="0"/>
+          <w:insideV w:val="none" w:color="FFFFFF" w:sz="0"/>
+        </w:tblBorders>
+      </w:tblPr>
+      <w:tblGrid>
+        <w:gridCol w:w="100"/>
+      </w:tblGrid>
+      <w:tr>
+        <w:tc>
+          <w:tcPr>
+            <w:shd w:fill="F0FDF4" w:val="clear"/>
+            <w:tcMar>
+              <w:top w:type="dxa" w:w="160"/>
+              <w:left w:type="dxa" w:w="220"/>
+              <w:bottom w:type="dxa" w:w="160"/>
+              <w:right w:type="dxa" w:w="220"/>
+            </w:tcMar>
+          </w:tcPr>
+          <w:p>
+            <w:pPr>
+              <w:spacing w:after="80"/>
+            </w:pPr>
+            <w:r>
+              <w:rPr>
+                <w:b/>
+                <w:bCs/>
+                <w:color w:val="15803D"/>
+              </w:rPr>
+              <w:t xml:space="preserve">💡 Date de récupération des invendus</w:t>
+            </w:r>
+          </w:p>
+          <w:p>
+            <w:pPr>
+              <w:spacing w:after="40"/>
+            </w:pPr>
+            <w:r>
+              <w:rPr>
+                <w:sz w:val="20"/>
+                <w:szCs w:val="20"/>
+              </w:rPr>
+              <w:t xml:space="preserve">Cette date et heure sont saisies une seule fois par le comité, dans la section « Récupération des invendus » du dashboard — elles s'appliquent ensuite automatiquement à tous les emails de confirmation envoyés.</w:t>
+            </w:r>
+          </w:p>
+        </w:tc>
+      </w:tr>
+    </w:tbl>
+    <w:p>
+      <w:pPr>
+        <w:pStyle w:val="Heading1"/>
+        <w:spacing w:after="200" w:before="400"/>
+      </w:pPr>
+      <w:r>
+        <w:rPr>
+          <w:b/>
+          <w:bCs/>
+          <w:color w:val="1F2937"/>
+        </w:rPr>
+        <w:t xml:space="preserve">Corriger les coordonnées du vendeur</w:t>
+      </w:r>
+    </w:p>
+    <w:p>
+      <w:pPr>
+        <w:spacing w:after="160"/>
+      </w:pPr>
+      <w:r>
+        <w:t xml:space="preserve">Sur la fiche du vendeur, le lien « Corriger les coordonnées » permet d'éditer le nom, le téléphone et l'email directement depuis l'accueil — utile si le vendeur a fait une erreur de saisie en ligne ou souhaite mettre à jour ses coordonnées le jour du dépôt.</w:t>
+      </w:r>
+    </w:p>
+    <w:p>
+      <w:pPr>
+        <w:spacing w:after="0" w:before="160"/>
+      </w:pPr>
+    </w:p>
+    <w:tbl>
+      <w:tblPr>
+        <w:tblW w:type="dxa" w:w="9676"/>
+        <w:jc w:val="center"/>
+        <w:tblBorders>
+          <w:top w:val="single" w:color="D4D4D8" w:sz="4"/>
+          <w:left w:val="single" w:color="D4D4D8" w:sz="4"/>
+          <w:bottom w:val="single" w:color="D4D4D8" w:sz="4"/>
+          <w:right w:val="single" w:color="D4D4D8" w:sz="4"/>
+          <w:insideH w:val="none" w:color="FFFFFF" w:sz="0"/>
+          <w:insideV w:val="none" w:color="FFFFFF" w:sz="0"/>
+        </w:tblBorders>
+      </w:tblPr>
+      <w:tblGrid>
+        <w:gridCol w:w="100"/>
+      </w:tblGrid>
+      <w:tr>
+        <w:tc>
+          <w:tcPr>
+            <w:tcMar>
+              <w:top w:type="dxa" w:w="100"/>
+              <w:left w:type="dxa" w:w="100"/>
+              <w:bottom w:type="dxa" w:w="100"/>
+              <w:right w:type="dxa" w:w="100"/>
+            </w:tcMar>
+          </w:tcPr>
+          <w:p>
+            <w:pPr>
+              <w:jc w:val="center"/>
+            </w:pPr>
+            <w:r>
+              <w:drawing>
+                <wp:inline distT="0" distB="0" distL="0" distR="0">
+                  <wp:extent cx="5762625" cy="4324350"/>
+                  <wp:effectExtent t="0" r="0" b="0" l="0"/>
+                  <wp:docPr id="1" name="" descr="" title=""/>
+                  <wp:cNvGraphicFramePr>
+                    <a:graphicFrameLocks xmlns:a="http://schemas.openxmlformats.org/drawingml/2006/main" noChangeAspect="1"/>
+                  </wp:cNvGraphicFramePr>
+                  <a:graphic xmlns:a="http://schemas.openxmlformats.org/drawingml/2006/main">
+                    <a:graphicData uri="http://schemas.openxmlformats.org/drawingml/2006/picture">
+                      <pic:pic xmlns:pic="http://schemas.openxmlformats.org/drawingml/2006/picture">
+                        <pic:nvPicPr>
+                          <pic:cNvPr id="0" name="" descr=""/>
+                          <pic:cNvPicPr>
+                            <a:picLocks noChangeAspect="1" noChangeArrowheads="1"/>
+                          </pic:cNvPicPr>
+                        </pic:nvPicPr>
+                        <pic:blipFill>
+                          <a:blip r:embed="rId17" cstate="none"/>
+                          <a:srcRect/>
+                          <a:stretch>
+                            <a:fillRect/>
+                          </a:stretch>
+                        </pic:blipFill>
+                        <pic:spPr bwMode="auto">
+                          <a:xfrm>
+                            <a:off x="0" y="0"/>
+                            <a:ext cx="5762625" cy="4324350"/>
+                          </a:xfrm>
+                          <a:prstGeom prst="rect">
+                            <a:avLst/>
+                          </a:prstGeom>
+                        </pic:spPr>
+                      </pic:pic>
+                    </a:graphicData>
+                  </a:graphic>
+                </wp:inline>
+              </w:drawing>
+            </w:r>
+          </w:p>
+        </w:tc>
+      </w:tr>
+    </w:tbl>
+    <w:p>
+      <w:pPr>
+        <w:spacing w:after="60" w:before="0"/>
+      </w:pPr>
+    </w:p>
+    <w:p>
+      <w:pPr>
+        <w:spacing w:after="200"/>
+        <w:jc w:val="center"/>
+      </w:pPr>
+      <w:r>
+        <w:rPr>
+          <w:i/>
+          <w:iCs/>
+          <w:color w:val="6B7280"/>
+          <w:sz w:val="18"/>
+          <w:szCs w:val="18"/>
+        </w:rPr>
+        <w:t xml:space="preserve">Édition des coordonnées du vendeur, directement depuis l'accueil.</w:t>
+      </w:r>
+    </w:p>
+    <w:p>
+      <w:pPr>
+        <w:pStyle w:val="Heading1"/>
+        <w:spacing w:after="200" w:before="400"/>
+      </w:pPr>
+      <w:r>
+        <w:rPr>
+          <w:b/>
+          <w:bCs/>
+          <w:color w:val="1F2937"/>
+        </w:rPr>
+        <w:t xml:space="preserve">Imprimer les étiquettes</w:t>
+      </w:r>
+    </w:p>
+    <w:p>
+      <w:pPr>
+        <w:spacing w:after="160"/>
+      </w:pPr>
+      <w:r>
+        <w:t xml:space="preserve">Le bouton « Imprimer les étiquettes » génère une planche prête à découper : une étiquette par article, avec son QR code, son prix et le numéro du vendeur — plus une étiquette d'en-tête avec le nom et le numéro du vendeur, à poser sur son enveloppe ou son bac.</w:t>
+      </w:r>
+    </w:p>
+    <w:p>
+      <w:pPr>
+        <w:spacing w:after="0" w:before="160"/>
+      </w:pPr>
+    </w:p>
+    <w:tbl>
+      <w:tblPr>
+        <w:tblW w:type="dxa" w:w="9676"/>
+        <w:jc w:val="center"/>
+        <w:tblBorders>
+          <w:top w:val="single" w:color="D4D4D8" w:sz="4"/>
+          <w:left w:val="single" w:color="D4D4D8" w:sz="4"/>
+          <w:bottom w:val="single" w:color="D4D4D8" w:sz="4"/>
+          <w:right w:val="single" w:color="D4D4D8" w:sz="4"/>
+          <w:insideH w:val="none" w:color="FFFFFF" w:sz="0"/>
+          <w:insideV w:val="none" w:color="FFFFFF" w:sz="0"/>
+        </w:tblBorders>
+      </w:tblPr>
+      <w:tblGrid>
+        <w:gridCol w:w="100"/>
+      </w:tblGrid>
+      <w:tr>
+        <w:tc>
+          <w:tcPr>
+            <w:tcMar>
+              <w:top w:type="dxa" w:w="100"/>
+              <w:left w:type="dxa" w:w="100"/>
+              <w:bottom w:type="dxa" w:w="100"/>
+              <w:right w:type="dxa" w:w="100"/>
+            </w:tcMar>
+          </w:tcPr>
+          <w:p>
+            <w:pPr>
+              <w:jc w:val="center"/>
+            </w:pPr>
+            <w:r>
+              <w:drawing>
+                <wp:inline distT="0" distB="0" distL="0" distR="0">
+                  <wp:extent cx="5762625" cy="4324350"/>
+                  <wp:effectExtent t="0" r="0" b="0" l="0"/>
+                  <wp:docPr id="1" name="" descr="" title=""/>
+                  <wp:cNvGraphicFramePr>
+                    <a:graphicFrameLocks xmlns:a="http://schemas.openxmlformats.org/drawingml/2006/main" noChangeAspect="1"/>
+                  </wp:cNvGraphicFramePr>
+                  <a:graphic xmlns:a="http://schemas.openxmlformats.org/drawingml/2006/main">
+                    <a:graphicData uri="http://schemas.openxmlformats.org/drawingml/2006/picture">
+                      <pic:pic xmlns:pic="http://schemas.openxmlformats.org/drawingml/2006/picture">
+                        <pic:nvPicPr>
+                          <pic:cNvPr id="0" name="" descr=""/>
+                          <pic:cNvPicPr>
+                            <a:picLocks noChangeAspect="1" noChangeArrowheads="1"/>
+                          </pic:cNvPicPr>
+                        </pic:nvPicPr>
+                        <pic:blipFill>
+                          <a:blip r:embed="rId18" cstate="none"/>
+                          <a:srcRect/>
+                          <a:stretch>
+                            <a:fillRect/>
+                          </a:stretch>
+                        </pic:blipFill>
+                        <pic:spPr bwMode="auto">
+                          <a:xfrm>
+                            <a:off x="0" y="0"/>
+                            <a:ext cx="5762625" cy="4324350"/>
+                          </a:xfrm>
+                          <a:prstGeom prst="rect">
+                            <a:avLst/>
+                          </a:prstGeom>
+                        </pic:spPr>
+                      </pic:pic>
+                    </a:graphicData>
+                  </a:graphic>
+                </wp:inline>
+              </w:drawing>
+            </w:r>
+          </w:p>
+        </w:tc>
+      </w:tr>
+    </w:tbl>
+    <w:p>
+      <w:pPr>
+        <w:spacing w:after="60" w:before="0"/>
+      </w:pPr>
+    </w:p>
+    <w:p>
+      <w:pPr>
+        <w:spacing w:after="200"/>
+        <w:jc w:val="center"/>
+      </w:pPr>
+      <w:r>
+        <w:rPr>
+          <w:i/>
+          <w:iCs/>
+          <w:color w:val="6B7280"/>
+          <w:sz w:val="18"/>
+          <w:szCs w:val="18"/>
+        </w:rPr>
+        <w:t xml:space="preserve">Planche d'étiquettes prête à imprimer et découper.</w:t>
+      </w:r>
+    </w:p>
+    <w:p>
+      <w:pPr>
+        <w:pStyle w:val="Heading1"/>
+        <w:spacing w:after="200" w:before="400"/>
+      </w:pPr>
+      <w:r>
+        <w:rPr>
+          <w:b/>
+          <w:bCs/>
+          <w:color w:val="1F2937"/>
+        </w:rPr>
+        <w:t xml:space="preserve">Réimprimer une étiquette manuellement</w:t>
+      </w:r>
+    </w:p>
+    <w:p>
+      <w:pPr>
+        <w:spacing w:after="80"/>
+      </w:pPr>
+      <w:r>
+        <w:t xml:space="preserve">Si une étiquette est abîmée, mal collée ou perdue, le lien « Réimprimer une étiquette → » (sur la page Accueil) permet d'en réimprimer une seule, sans regénérer toute la planche du vendeur :</w:t>
+      </w:r>
+    </w:p>
+    <w:p>
+      <w:pPr>
+        <w:pStyle w:val="ListParagraph"/>
+        <w:numPr>
+          <w:ilvl w:val="0"/>
+          <w:numId w:val="2"/>
+        </w:numPr>
+        <w:spacing w:after="80"/>
+      </w:pPr>
+      <w:r>
+        <w:t xml:space="preserve">Sélectionner le numéro de vendeur, puis le numéro d'article.</w:t>
+      </w:r>
+    </w:p>
+    <w:p>
+      <w:pPr>
+        <w:pStyle w:val="ListParagraph"/>
+        <w:numPr>
+          <w:ilvl w:val="0"/>
+          <w:numId w:val="2"/>
+        </w:numPr>
+        <w:spacing w:after="80"/>
+      </w:pPr>
+      <w:r>
+        <w:t xml:space="preserve">Choisir sur le schéma de la feuille la case correspondant à l'emplacement encore vierge — cela permet de réutiliser plusieurs fois une même feuille d'étiquettes déjà entamée, sans gaspiller les cases déjà découpées.</w:t>
+      </w:r>
+    </w:p>
+    <w:p>
+      <w:pPr>
+        <w:pStyle w:val="ListParagraph"/>
+        <w:numPr>
+          <w:ilvl w:val="0"/>
+          <w:numId w:val="2"/>
+        </w:numPr>
+        <w:spacing w:after="80"/>
+      </w:pPr>
+      <w:r>
+        <w:t xml:space="preserve">Imprimer : seule l'étiquette choisie apparaît, à la bonne position sur la feuille.</w:t>
+      </w:r>
+    </w:p>
+    <w:p>
+      <w:pPr>
+        <w:spacing w:after="0" w:before="160"/>
+      </w:pPr>
+    </w:p>
+    <w:tbl>
+      <w:tblPr>
+        <w:tblW w:type="dxa" w:w="9676"/>
+        <w:jc w:val="center"/>
+        <w:tblBorders>
+          <w:top w:val="single" w:color="D4D4D8" w:sz="4"/>
+          <w:left w:val="single" w:color="D4D4D8" w:sz="4"/>
+          <w:bottom w:val="single" w:color="D4D4D8" w:sz="4"/>
+          <w:right w:val="single" w:color="D4D4D8" w:sz="4"/>
+          <w:insideH w:val="none" w:color="FFFFFF" w:sz="0"/>
+          <w:insideV w:val="none" w:color="FFFFFF" w:sz="0"/>
+        </w:tblBorders>
+      </w:tblPr>
+      <w:tblGrid>
+        <w:gridCol w:w="100"/>
+      </w:tblGrid>
+      <w:tr>
+        <w:tc>
+          <w:tcPr>
+            <w:tcMar>
+              <w:top w:type="dxa" w:w="100"/>
+              <w:left w:type="dxa" w:w="100"/>
+              <w:bottom w:type="dxa" w:w="100"/>
+              <w:right w:type="dxa" w:w="100"/>
+            </w:tcMar>
+          </w:tcPr>
+          <w:p>
+            <w:pPr>
+              <w:jc w:val="center"/>
+            </w:pPr>
+            <w:r>
+              <w:drawing>
+                <wp:inline distT="0" distB="0" distL="0" distR="0">
+                  <wp:extent cx="5762625" cy="4324350"/>
+                  <wp:effectExtent t="0" r="0" b="0" l="0"/>
+                  <wp:docPr id="1" name="" descr="" title=""/>
+                  <wp:cNvGraphicFramePr>
+                    <a:graphicFrameLocks xmlns:a="http://schemas.openxmlformats.org/drawingml/2006/main" noChangeAspect="1"/>
+                  </wp:cNvGraphicFramePr>
+                  <a:graphic xmlns:a="http://schemas.openxmlformats.org/drawingml/2006/main">
+                    <a:graphicData uri="http://schemas.openxmlformats.org/drawingml/2006/picture">
+                      <pic:pic xmlns:pic="http://schemas.openxmlformats.org/drawingml/2006/picture">
+                        <pic:nvPicPr>
+                          <pic:cNvPr id="0" name="" descr=""/>
+                          <pic:cNvPicPr>
+                            <a:picLocks noChangeAspect="1" noChangeArrowheads="1"/>
+                          </pic:cNvPicPr>
+                        </pic:nvPicPr>
+                        <pic:blipFill>
+                          <a:blip r:embed="rId19" cstate="none"/>
+                          <a:srcRect/>
+                          <a:stretch>
+                            <a:fillRect/>
+                          </a:stretch>
+                        </pic:blipFill>
+                        <pic:spPr bwMode="auto">
+                          <a:xfrm>
+                            <a:off x="0" y="0"/>
+                            <a:ext cx="5762625" cy="4324350"/>
+                          </a:xfrm>
+                          <a:prstGeom prst="rect">
+                            <a:avLst/>
+                          </a:prstGeom>
+                        </pic:spPr>
+                      </pic:pic>
+                    </a:graphicData>
+                  </a:graphic>
+                </wp:inline>
+              </w:drawing>
+            </w:r>
+          </w:p>
+        </w:tc>
+      </w:tr>
+    </w:tbl>
+    <w:p>
+      <w:pPr>
+        <w:spacing w:after="60" w:before="0"/>
+      </w:pPr>
+    </w:p>
+    <w:p>
+      <w:pPr>
+        <w:spacing w:after="200"/>
+        <w:jc w:val="center"/>
+      </w:pPr>
+      <w:r>
+        <w:rPr>
+          <w:i/>
+          <w:iCs/>
+          <w:color w:val="6B7280"/>
+          <w:sz w:val="18"/>
+          <w:szCs w:val="18"/>
+        </w:rPr>
+        <w:t xml:space="preserve">Recherche de l'article par numéro de vendeur et numéro d'article.</w:t>
+      </w:r>
+    </w:p>
+    <w:p>
+      <w:pPr>
+        <w:spacing w:after="0" w:before="160"/>
+      </w:pPr>
+    </w:p>
+    <w:tbl>
+      <w:tblPr>
+        <w:tblW w:type="dxa" w:w="9676"/>
+        <w:jc w:val="center"/>
+        <w:tblBorders>
+          <w:top w:val="single" w:color="D4D4D8" w:sz="4"/>
+          <w:left w:val="single" w:color="D4D4D8" w:sz="4"/>
+          <w:bottom w:val="single" w:color="D4D4D8" w:sz="4"/>
+          <w:right w:val="single" w:color="D4D4D8" w:sz="4"/>
+          <w:insideH w:val="none" w:color="FFFFFF" w:sz="0"/>
+          <w:insideV w:val="none" w:color="FFFFFF" w:sz="0"/>
+        </w:tblBorders>
+      </w:tblPr>
+      <w:tblGrid>
+        <w:gridCol w:w="100"/>
+      </w:tblGrid>
+      <w:tr>
+        <w:tc>
+          <w:tcPr>
+            <w:tcMar>
+              <w:top w:type="dxa" w:w="100"/>
+              <w:left w:type="dxa" w:w="100"/>
+              <w:bottom w:type="dxa" w:w="100"/>
+              <w:right w:type="dxa" w:w="100"/>
+            </w:tcMar>
+          </w:tcPr>
+          <w:p>
+            <w:pPr>
+              <w:jc w:val="center"/>
+            </w:pPr>
+            <w:r>
+              <w:drawing>
+                <wp:inline distT="0" distB="0" distL="0" distR="0">
+                  <wp:extent cx="5762625" cy="4324350"/>
+                  <wp:effectExtent t="0" r="0" b="0" l="0"/>
+                  <wp:docPr id="1" name="" descr="" title=""/>
+                  <wp:cNvGraphicFramePr>
+                    <a:graphicFrameLocks xmlns:a="http://schemas.openxmlformats.org/drawingml/2006/main" noChangeAspect="1"/>
+                  </wp:cNvGraphicFramePr>
+                  <a:graphic xmlns:a="http://schemas.openxmlformats.org/drawingml/2006/main">
+                    <a:graphicData uri="http://schemas.openxmlformats.org/drawingml/2006/picture">
+                      <pic:pic xmlns:pic="http://schemas.openxmlformats.org/drawingml/2006/picture">
+                        <pic:nvPicPr>
+                          <pic:cNvPr id="0" name="" descr=""/>
+                          <pic:cNvPicPr>
+                            <a:picLocks noChangeAspect="1" noChangeArrowheads="1"/>
+                          </pic:cNvPicPr>
+                        </pic:nvPicPr>
+                        <pic:blipFill>
+                          <a:blip r:embed="rId20" cstate="none"/>
+                          <a:srcRect/>
+                          <a:stretch>
+                            <a:fillRect/>
+                          </a:stretch>
+                        </pic:blipFill>
+                        <pic:spPr bwMode="auto">
+                          <a:xfrm>
+                            <a:off x="0" y="0"/>
+                            <a:ext cx="5762625" cy="4324350"/>
+                          </a:xfrm>
+                          <a:prstGeom prst="rect">
+                            <a:avLst/>
+                          </a:prstGeom>
+                        </pic:spPr>
+                      </pic:pic>
+                    </a:graphicData>
+                  </a:graphic>
+                </wp:inline>
+              </w:drawing>
+            </w:r>
+          </w:p>
+        </w:tc>
+      </w:tr>
+    </w:tbl>
+    <w:p>
+      <w:pPr>
+        <w:spacing w:after="60" w:before="0"/>
+      </w:pPr>
+    </w:p>
+    <w:p>
+      <w:pPr>
+        <w:spacing w:after="200"/>
+        <w:jc w:val="center"/>
+      </w:pPr>
+      <w:r>
+        <w:rPr>
+          <w:i/>
+          <w:iCs/>
+          <w:color w:val="6B7280"/>
+          <w:sz w:val="18"/>
+          <w:szCs w:val="18"/>
+        </w:rPr>
+        <w:t xml:space="preserve">Étiquette générée à la position choisie, prête à imprimer.</w:t>
+      </w:r>
+    </w:p>
+    <w:p>
+      <w:pPr>
+        <w:pStyle w:val="Heading1"/>
+        <w:spacing w:after="200" w:before="400"/>
+      </w:pPr>
+      <w:r>
+        <w:rPr>
+          <w:b/>
+          <w:bCs/>
+          <w:color w:val="1F2937"/>
+        </w:rPr>
+        <w:t xml:space="preserve">Un vendeur sans dépôt en ligne</w:t>
+      </w:r>
+    </w:p>
+    <w:p>
+      <w:pPr>
+        <w:spacing w:after="160"/>
+      </w:pPr>
+      <w:r>
+        <w:t xml:space="preserve">Si un vendeur se présente sans avoir déposé sa liste en ligne au préalable, le bouton « + Liste sur place » (en haut de la page Accueil) permet de saisir sa liste directement — mêmes champs, mêmes contrôles que le formulaire en ligne (nom, téléphone portable, conditions à accepter, articles).</w:t>
+      </w:r>
+    </w:p>
+    <w:p>
+      <w:pPr>
+        <w:spacing w:after="0" w:before="160"/>
+      </w:pPr>
+    </w:p>
+    <w:tbl>
+      <w:tblPr>
+        <w:tblW w:type="dxa" w:w="9676"/>
+        <w:jc w:val="center"/>
+        <w:tblBorders>
+          <w:top w:val="single" w:color="D4D4D8" w:sz="4"/>
+          <w:left w:val="single" w:color="D4D4D8" w:sz="4"/>
+          <w:bottom w:val="single" w:color="D4D4D8" w:sz="4"/>
+          <w:right w:val="single" w:color="D4D4D8" w:sz="4"/>
+          <w:insideH w:val="none" w:color="FFFFFF" w:sz="0"/>
+          <w:insideV w:val="none" w:color="FFFFFF" w:sz="0"/>
+        </w:tblBorders>
+      </w:tblPr>
+      <w:tblGrid>
+        <w:gridCol w:w="100"/>
+      </w:tblGrid>
+      <w:tr>
+        <w:tc>
+          <w:tcPr>
+            <w:tcMar>
+              <w:top w:type="dxa" w:w="100"/>
+              <w:left w:type="dxa" w:w="100"/>
+              <w:bottom w:type="dxa" w:w="100"/>
+              <w:right w:type="dxa" w:w="100"/>
+            </w:tcMar>
+          </w:tcPr>
+          <w:p>
+            <w:pPr>
+              <w:jc w:val="center"/>
+            </w:pPr>
+            <w:r>
+              <w:drawing>
+                <wp:inline distT="0" distB="0" distL="0" distR="0">
+                  <wp:extent cx="3981450" cy="7458075"/>
+                  <wp:effectExtent t="0" r="0" b="0" l="0"/>
+                  <wp:docPr id="1" name="" descr="" title=""/>
+                  <wp:cNvGraphicFramePr>
+                    <a:graphicFrameLocks xmlns:a="http://schemas.openxmlformats.org/drawingml/2006/main" noChangeAspect="1"/>
+                  </wp:cNvGraphicFramePr>
+                  <a:graphic xmlns:a="http://schemas.openxmlformats.org/drawingml/2006/main">
+                    <a:graphicData uri="http://schemas.openxmlformats.org/drawingml/2006/picture">
+                      <pic:pic xmlns:pic="http://schemas.openxmlformats.org/drawingml/2006/picture">
+                        <pic:nvPicPr>
+                          <pic:cNvPr id="0" name="" descr=""/>
+                          <pic:cNvPicPr>
+                            <a:picLocks noChangeAspect="1" noChangeArrowheads="1"/>
+                          </pic:cNvPicPr>
+                        </pic:nvPicPr>
+                        <pic:blipFill>
+                          <a:blip r:embed="rId21" cstate="none"/>
+                          <a:srcRect/>
+                          <a:stretch>
+                            <a:fillRect/>
+                          </a:stretch>
+                        </pic:blipFill>
+                        <pic:spPr bwMode="auto">
+                          <a:xfrm>
+                            <a:off x="0" y="0"/>
+                            <a:ext cx="3981450" cy="7458075"/>
                           </a:xfrm>
                           <a:prstGeom prst="rect">
                             <a:avLst/>
@@ -1340,10 +2025,10 @@
   <w:p>
     <w:pPr>
       <w:pBdr>
-        <w:bottom w:val="single" w:color="D4D4D8" w:sz="4"/>
+        <w:bottom w:val="single" w:color="D4D4D8" w:sz="4" w:space="4"/>
       </w:pBdr>
       <w:tabs>
-        <w:tab w:val="right" w:pos="9060"/>
+        <w:tab w:val="right" w:pos="9026"/>
       </w:tabs>
       <w:spacing w:after="0"/>
     </w:pPr>
@@ -1457,11 +2142,11 @@
     <w:multiLevelType w:val="hybridMultilevel"/>
     <w:lvl w:ilvl="0" w15:tentative="1">
       <w:start w:val="1"/>
-      <w:numFmt w:val="bullet"/>
-      <w:lvlText w:val="•"/>
+      <w:numFmt w:val="decimal"/>
+      <w:lvlText w:val="%1."/>
       <w:lvlJc w:val="left"/>
       <w:pPr>
-        <w:ind w:left="420" w:hanging="260"/>
+        <w:ind w:left="417" w:hanging="259"/>
       </w:pPr>
     </w:lvl>
   </w:abstractNum>
@@ -1469,11 +2154,11 @@
     <w:multiLevelType w:val="hybridMultilevel"/>
     <w:lvl w:ilvl="0" w15:tentative="1">
       <w:start w:val="1"/>
-      <w:numFmt w:val="decimal"/>
-      <w:lvlText w:val="%1."/>
+      <w:numFmt w:val="bullet"/>
+      <w:lvlText w:val="•"/>
       <w:lvlJc w:val="left"/>
       <w:pPr>
-        <w:ind w:left="420" w:hanging="260"/>
+        <w:ind w:left="417" w:hanging="259"/>
       </w:pPr>
     </w:lvl>
   </w:abstractNum>
@@ -1484,13 +2169,13 @@
     </w:lvlOverride>
   </w:num>
   <w:num w:numId="2">
-    <w:abstractNumId w:val="3"/>
+    <w:abstractNumId w:val="2"/>
     <w:lvlOverride w:ilvl="0">
       <w:startOverride w:val="1"/>
     </w:lvlOverride>
   </w:num>
   <w:num w:numId="3">
-    <w:abstractNumId w:val="2"/>
+    <w:abstractNumId w:val="3"/>
     <w:lvlOverride w:ilvl="0">
       <w:startOverride w:val="1"/>
     </w:lvlOverride>

</xml_diff>